<commit_message>
Rebuild model-grounded interactive training deck
</commit_message>
<xml_diff>
--- a/report.docx
+++ b/report.docx
@@ -7,7 +7,7 @@
         <w:pStyle w:val="Title"/>
       </w:pPr>
       <w:r>
-        <w:t xml:space="preserve">Intercultural Manager Training Report: US Google Advertising Managers in Japan</w:t>
+        <w:t xml:space="preserve">US Google Advertising Managers to Japan — Model-Grounded Training Report</w:t>
       </w:r>
     </w:p>
     <w:p>
@@ -15,7 +15,7 @@
         <w:pStyle w:val="Subtitle"/>
       </w:pPr>
       <w:r>
-        <w:t xml:space="preserve">Culture, sector, model comparison, risk areas, and practical guideline</w:t>
+        <w:t xml:space="preserve">Hofstede, Hall, Trompenaars, and World Values Survey / Inglehart-Welzel</w:t>
       </w:r>
     </w:p>
     <w:p>
@@ -34,47 +34,12 @@
         <w:t xml:space="preserve">June 2026</w:t>
       </w:r>
     </w:p>
-    <w:sdt>
-      <w:sdtPr>
-        <w:docPartObj>
-          <w:docPartGallery w:val="Table of Contents"/>
-          <w:docPartUnique/>
-        </w:docPartObj>
-      </w:sdtPr>
-      <w:sdtContent>
-        <w:p>
-          <w:pPr>
-            <w:pStyle w:val="TOCHeading"/>
-          </w:pPr>
-          <w:r>
-            <w:t xml:space="preserve">Table of Contents</w:t>
-          </w:r>
-        </w:p>
-        <w:p>
-          <w:r>
-            <w:fldChar w:fldCharType="begin" w:dirty="true"/>
-            <w:instrText xml:space="preserve">TOC \o "1-3" \h \z \u</w:instrText>
-            <w:fldChar w:fldCharType="separate"/>
-            <w:fldChar w:fldCharType="end"/>
-          </w:r>
-        </w:p>
-      </w:sdtContent>
-    </w:sdt>
     <w:bookmarkStart w:id="9" w:name="executive-summary"/>
     <w:p>
       <w:pPr>
         <w:pStyle w:val="Heading1"/>
       </w:pPr>
       <w:r>
-        <w:rPr>
-          <w:rStyle w:val="SectionNumber"/>
-        </w:rPr>
-        <w:t xml:space="preserve">1</w:t>
-      </w:r>
-      <w:r>
-        <w:tab/>
-      </w:r>
-      <w:r>
         <w:t xml:space="preserve">Executive summary</w:t>
       </w:r>
     </w:p>
@@ -83,7 +48,7 @@
         <w:pStyle w:val="FirstParagraph"/>
       </w:pPr>
       <w:r>
-        <w:t xml:space="preserve">This training is designed for managers from a</w:t>
+        <w:t xml:space="preserve">This report trains managers from a</w:t>
       </w:r>
       <w:r>
         <w:t xml:space="preserve"> </w:t>
@@ -99,7 +64,7 @@
         <w:t xml:space="preserve"> </w:t>
       </w:r>
       <w:r>
-        <w:t xml:space="preserve">being assigned to</w:t>
+        <w:t xml:space="preserve">who are being sent to</w:t>
       </w:r>
       <w:r>
         <w:t xml:space="preserve"> </w:t>
@@ -112,7 +77,23 @@
         <w:t xml:space="preserve">Japan</w:t>
       </w:r>
       <w:r>
-        <w:t xml:space="preserve">. The company culture used as the home-side reference is therefore not a generic advertising agency culture, but a US-based platform business whose commercial role is to</w:t>
+        <w:t xml:space="preserve">. The sector is digital advertising platform sales: managers sell advertising space, audience access, bidding, measurement, and platform advertising solutions. Advertisers remain responsible for their end-to-end creative and media execution.</w:t>
+      </w:r>
+    </w:p>
+    <w:p>
+      <w:pPr>
+        <w:pStyle w:val="BodyText"/>
+      </w:pPr>
+      <w:r>
+        <w:t xml:space="preserve">The analysis is deliberately grounded in the four required cultural models only: Hofstede, Hall, Trompenaars, and the World Values Survey / Inglehart-Welzel cultural map. The models do not define individuals. They provide structured hypotheses for preparation, comparison, risk identification, and guideline development.</w:t>
+      </w:r>
+    </w:p>
+    <w:p>
+      <w:pPr>
+        <w:pStyle w:val="BodyText"/>
+      </w:pPr>
+      <w:r>
+        <w:t xml:space="preserve">The core recommendation is:</w:t>
       </w:r>
       <w:r>
         <w:t xml:space="preserve"> </w:t>
@@ -122,52 +103,10 @@
           <w:b/>
           <w:bCs/>
         </w:rPr>
-        <w:t xml:space="preserve">sell advertising space and platform advertising solutions on Google-owned platforms</w:t>
-      </w:r>
-      <w:r>
-        <w:t xml:space="preserve">. The managers are being trained to sell, recommend, support, and govern platform advertising solutions in a Japanese business environment, not to take responsibility for advertisers’ end-to-end creative or media execution. This distinction matters because the cultural risk is not only creative execution, but also client trust, platform recommendations, sales promises, stakeholder approval, and brand-safety expectations (Google Partner Marketing Hub, n.d.; Hofstede, 1983, 1984).</w:t>
-      </w:r>
-    </w:p>
-    <w:p>
-      <w:pPr>
-        <w:pStyle w:val="BodyText"/>
-      </w:pPr>
-      <w:r>
-        <w:t xml:space="preserve">The main finding is that the US and Japan are both advanced, achievement-oriented business environments, but they differ strongly in how they handle</w:t>
-      </w:r>
-      <w:r>
-        <w:t xml:space="preserve"> </w:t>
-      </w:r>
-      <w:r>
-        <w:rPr>
-          <w:b/>
-          <w:bCs/>
-        </w:rPr>
-        <w:t xml:space="preserve">context, hierarchy, risk, disagreement, trust, and decision tempo</w:t>
-      </w:r>
-      <w:r>
-        <w:t xml:space="preserve">. US managers are more likely to rely on explicit communication, fast iteration, individual ownership, and short-cycle performance arguments. Japanese counterparts are more likely to expect stronger pre-alignment, formal respect, indirect signals, risk controls, process quality, and reliability over time (Hall, 1976; Hofstede, 1984; Graham &amp; Sano, 1989; Dyer &amp; Chu, 1998; Beugelsdijk &amp; Welzel, 2018).</w:t>
-      </w:r>
-    </w:p>
-    <w:p>
-      <w:pPr>
-        <w:pStyle w:val="BodyText"/>
-      </w:pPr>
-      <w:r>
-        <w:t xml:space="preserve">The practical training guideline is simple:</w:t>
-      </w:r>
-      <w:r>
-        <w:t xml:space="preserve"> </w:t>
-      </w:r>
-      <w:r>
-        <w:rPr>
-          <w:b/>
-          <w:bCs/>
-        </w:rPr>
-        <w:t xml:space="preserve">translate US speed into Japanese-quality process</w:t>
-      </w:r>
-      <w:r>
-        <w:t xml:space="preserve">. For Google Advertising managers, this means every important proposal should be framed as a controlled, well-prepared, stakeholder-safe recommendation: documented rationale, risk boundaries, brand-safety check, approval chain, reporting cadence, and fallback path. Managers should use cultural models as preparation lenses, not stereotypes. Google Japan is not identical to a traditional domestic Japanese company; it is urban, technological, multinational, and shaped by Google’s own organizational culture. The models help managers ask better questions, not label people (Taras et al., 2010; Kirkman et al., 2017; Beugelsdijk &amp; Welzel, 2018).</w:t>
+        <w:t xml:space="preserve">make US speed legible as Japanese-quality control</w:t>
+      </w:r>
+      <w:r>
+        <w:t xml:space="preserve">. In practice this means pre-alignment before formal meetings, explicit risk boundaries, hierarchy-aware communication, private concern channels, and long-term trust/reputation framing.</w:t>
       </w:r>
     </w:p>
     <w:bookmarkEnd w:id="9"/>
@@ -176,15 +115,6 @@
       <w:pPr>
         <w:pStyle w:val="Heading1"/>
       </w:pPr>
-      <w:r>
-        <w:rPr>
-          <w:rStyle w:val="SectionNumber"/>
-        </w:rPr>
-        <w:t xml:space="preserve">2</w:t>
-      </w:r>
-      <w:r>
-        <w:tab/>
-      </w:r>
       <w:r>
         <w:t xml:space="preserve">1. Home culture and sector</w:t>
       </w:r>
@@ -207,7 +137,7 @@
         <w:t xml:space="preserve">United States</w:t>
       </w:r>
       <w:r>
-        <w:t xml:space="preserve">, and the sector is</w:t>
+        <w:t xml:space="preserve">. The sector is</w:t>
       </w:r>
       <w:r>
         <w:t xml:space="preserve"> </w:t>
@@ -217,10 +147,13 @@
           <w:b/>
           <w:bCs/>
         </w:rPr>
-        <w:t xml:space="preserve">digital advertising / advertising platform sales</w:t>
-      </w:r>
-      <w:r>
-        <w:t xml:space="preserve">. In this constellation, the US organization’s commercial logic is platform-side: managers sell and support advertising products, inventory, audience access, measurement systems, and optimization mechanisms on Google platforms. The training therefore treats “Google Advertising” as a platform and media-sales environment, not as an external creative agency (Google Partner Marketing Hub, n.d.).</w:t>
+        <w:t xml:space="preserve">advertising platform sales</w:t>
+      </w:r>
+      <w:r>
+        <w:t xml:space="preserve"> </w:t>
+      </w:r>
+      <w:r>
+        <w:t xml:space="preserve">inside Google Advertising. The relevant management task is not campaign development for advertisers but the sale and support of platform advertising solutions.</w:t>
       </w:r>
     </w:p>
     <w:p>
@@ -228,15 +161,7 @@
         <w:pStyle w:val="BodyText"/>
       </w:pPr>
       <w:r>
-        <w:t xml:space="preserve">The Google brand must be represented accurately. Google’s public brand guidance states that Google’s role should always be shown accurately and that visual or messaging choices should not overstate Google’s involvement or imply endorsement where none exists. It also instructs users not to modify Google logos and to use full-color Google marks on white or black backgrounds where appropriate. This training package follows that logic by using Google-color accents and plain text references, not a modified Google logo or co-branding treatment (Google Partner Marketing Hub, n.d.).</w:t>
-      </w:r>
-    </w:p>
-    <w:p>
-      <w:pPr>
-        <w:pStyle w:val="BodyText"/>
-      </w:pPr>
-      <w:r>
-        <w:t xml:space="preserve">The relevant home-culture management tendencies are: explicit communication, relatively low power distance, strong individual accountability, comfort with debate, optimism about action and optimization, and a tendency to value speed, clarity, and measurable outcomes. These tendencies are supported by Hofstede’s US scores, Hall’s low-context communication model, and the broader management literature on national culture and managerial behavior (Hall, 1976; Hofstede, 1983, 1984; Smith et al., 2002; The Culture Factor Group, n.d.).</w:t>
+        <w:t xml:space="preserve">The US-side operating style is likely to include explicit communication, direct action orientation, lower tolerance for unclear ownership, and a preference for measurable next steps. These are model-based tendencies, not universal descriptions of every US manager.</w:t>
       </w:r>
     </w:p>
     <w:bookmarkEnd w:id="10"/>
@@ -246,15 +171,6 @@
         <w:pStyle w:val="Heading1"/>
       </w:pPr>
       <w:r>
-        <w:rPr>
-          <w:rStyle w:val="SectionNumber"/>
-        </w:rPr>
-        <w:t xml:space="preserve">3</w:t>
-      </w:r>
-      <w:r>
-        <w:tab/>
-      </w:r>
-      <w:r>
         <w:t xml:space="preserve">2. Applying the models to the home culture: United States</w:t>
       </w:r>
     </w:p>
@@ -264,15 +180,6 @@
         <w:pStyle w:val="Heading2"/>
       </w:pPr>
       <w:r>
-        <w:rPr>
-          <w:rStyle w:val="SectionNumber"/>
-        </w:rPr>
-        <w:t xml:space="preserve">3.1</w:t>
-      </w:r>
-      <w:r>
-        <w:tab/>
-      </w:r>
-      <w:r>
         <w:t xml:space="preserve">Hofstede</w:t>
       </w:r>
     </w:p>
@@ -281,15 +188,7 @@
         <w:pStyle w:val="FirstParagraph"/>
       </w:pPr>
       <w:r>
-        <w:t xml:space="preserve">The classic Hofstede profile for the United States shows low-to-moderate power distance, very high individualism, high achievement orientation, lower uncertainty avoidance than Japan, shorter-term orientation than Japan, and higher indulgence. Common training values are Power Distance 40, Individualism 91, Masculinity/Achievement 62, Uncertainty Avoidance 46, Long-Term Orientation 26, and Indulgence 68. The Culture Factor’s current online presentation uses some revised labels and values, but the stable training interpretation remains that US business culture tends to favor accessible managers, explicit ownership, debate, initiative, and tolerance for experimentation compared with Japan (Hofstede, 1984; The Culture Factor Group, n.d.; Taras et al., 2010).</w:t>
-      </w:r>
-    </w:p>
-    <w:p>
-      <w:pPr>
-        <w:pStyle w:val="BodyText"/>
-      </w:pPr>
-      <w:r>
-        <w:t xml:space="preserve">For Google Advertising managers, this can produce strengths: clarity, speed, measurable thinking, and ownership. It can also produce risks: pushing decisions too quickly, interpreting hesitation as lack of competence, or framing weak client outcomes as individual failure rather than as a joint process/system issue (Hofstede, 1983; Smith et al., 2002).</w:t>
+        <w:t xml:space="preserve">In Hofstede’s model, the United States is commonly interpreted as lower in power distance than many hierarchical business cultures, highly individualistic, relatively lower in uncertainty avoidance than Japan, and more indulgent/self-expressive. For managers, this supports expectations of accessible leadership, personal accountability, debate, and experimentation.</w:t>
       </w:r>
     </w:p>
     <w:bookmarkEnd w:id="11"/>
@@ -299,15 +198,6 @@
         <w:pStyle w:val="Heading2"/>
       </w:pPr>
       <w:r>
-        <w:rPr>
-          <w:rStyle w:val="SectionNumber"/>
-        </w:rPr>
-        <w:t xml:space="preserve">3.2</w:t>
-      </w:r>
-      <w:r>
-        <w:tab/>
-      </w:r>
-      <w:r>
         <w:t xml:space="preserve">Hall</w:t>
       </w:r>
     </w:p>
@@ -316,31 +206,7 @@
         <w:pStyle w:val="FirstParagraph"/>
       </w:pPr>
       <w:r>
-        <w:t xml:space="preserve">Hall’s model positions the United States as more</w:t>
-      </w:r>
-      <w:r>
-        <w:t xml:space="preserve"> </w:t>
-      </w:r>
-      <w:r>
-        <w:rPr>
-          <w:b/>
-          <w:bCs/>
-        </w:rPr>
-        <w:t xml:space="preserve">low-context</w:t>
-      </w:r>
-      <w:r>
-        <w:t xml:space="preserve"> </w:t>
-      </w:r>
-      <w:r>
-        <w:t xml:space="preserve">than Japan: meaning is expected to sit in explicit words, direct commitments, and clear written action items. US managers often prefer direct agenda-setting and explicit disagreement when a decision is needed. Hall’s chronemics also helps explain the US tendency to treat meetings as decision/action mechanisms, not only as confirmation rituals after prior alignment (Hall, 1976; Nishimura et al., 2008).</w:t>
-      </w:r>
-    </w:p>
-    <w:p>
-      <w:pPr>
-        <w:pStyle w:val="BodyText"/>
-      </w:pPr>
-      <w:r>
-        <w:t xml:space="preserve">For advertising-platform work, this means US managers may present a recommendation as: problem → option → metric → launch. That structure is efficient, but it may under-communicate stakeholder sensitivity, local client context, and risk controls in Japan (Hall, 1976; Graham &amp; Sano, 1989).</w:t>
+        <w:t xml:space="preserve">Hall’s model frames the United States as relatively low-context: meaning is expected to be explicit in words, agendas, commitments, written summaries, and direct disagreement. This supports speed, but can under-read silence or indirect concern in Japan.</w:t>
       </w:r>
     </w:p>
     <w:bookmarkEnd w:id="12"/>
@@ -350,15 +216,6 @@
         <w:pStyle w:val="Heading2"/>
       </w:pPr>
       <w:r>
-        <w:rPr>
-          <w:rStyle w:val="SectionNumber"/>
-        </w:rPr>
-        <w:t xml:space="preserve">3.3</w:t>
-      </w:r>
-      <w:r>
-        <w:tab/>
-      </w:r>
-      <w:r>
         <w:t xml:space="preserve">Trompenaars</w:t>
       </w:r>
     </w:p>
@@ -367,34 +224,17 @@
         <w:pStyle w:val="FirstParagraph"/>
       </w:pPr>
       <w:r>
-        <w:t xml:space="preserve">The US home culture can be interpreted as more universalist, individualist, specific, achievement-oriented, sequential-time oriented, and internally controlled. In practice, US managers may assume that global policy, explicit process, personal accountability, and “fix the system” action language are enough to move work forward (Smith et al., 1995; Smith et al., 2002).</w:t>
-      </w:r>
-    </w:p>
-    <w:p>
-      <w:pPr>
-        <w:pStyle w:val="BodyText"/>
-      </w:pPr>
-      <w:r>
-        <w:t xml:space="preserve">That is useful inside a fast platform environment, but it can clash with host-culture expectations where seniority, face, relationship history, and context-sensitive implementation matter (Graham &amp; Sano, 1989; Smith et al., 2002).</w:t>
+        <w:t xml:space="preserve">Using Trompenaars, the US side can be read as more universalist, specific, achievement-oriented, sequential-time oriented, and internal-control oriented. Managers may expect rules, expertise, metrics, and clear ownership to be enough to move work forward.</w:t>
       </w:r>
     </w:p>
     <w:bookmarkEnd w:id="13"/>
-    <w:bookmarkStart w:id="14" w:name="Xbaf56df45ffe70c2f2f330bfbabcfa5659731e2"/>
+    <w:bookmarkStart w:id="14" w:name="world-values-survey-inglehart-welzel"/>
     <w:p>
       <w:pPr>
         <w:pStyle w:val="Heading2"/>
       </w:pPr>
       <w:r>
-        <w:rPr>
-          <w:rStyle w:val="SectionNumber"/>
-        </w:rPr>
-        <w:t xml:space="preserve">3.4</w:t>
-      </w:r>
-      <w:r>
-        <w:tab/>
-      </w:r>
-      <w:r>
-        <w:t xml:space="preserve">World Values Survey / Inglehart-Welzel Cultural Map</w:t>
+        <w:t xml:space="preserve">World Values Survey / Inglehart-Welzel</w:t>
       </w:r>
     </w:p>
     <w:p>
@@ -402,15 +242,7 @@
         <w:pStyle w:val="FirstParagraph"/>
       </w:pPr>
       <w:r>
-        <w:t xml:space="preserve">The Inglehart-Welzel framework distinguishes traditional vs secular-rational values and survival vs self-expression values. The United States is generally treated as a wealthy society with strong self-expression values, individual voice, autonomy, and visible public debate, even while retaining some traditional-value elements compared with parts of Northern Europe (Inglehart &amp; Welzel, 2005; World Values Survey Association, n.d.; Beugelsdijk &amp; Welzel, 2018).</w:t>
-      </w:r>
-    </w:p>
-    <w:p>
-      <w:pPr>
-        <w:pStyle w:val="BodyText"/>
-      </w:pPr>
-      <w:r>
-        <w:t xml:space="preserve">For management training, this reinforces a key home-culture pattern: US managers may assume that open voice, direct feedback, and individual initiative are naturally positive. In Japan, the same behaviors may need different channels and stronger face-saving design (Beugelsdijk &amp; Welzel, 2018; Kirkman et al., 2017).</w:t>
+        <w:t xml:space="preserve">The WVS lens places the United States among advanced societies with strong self-expression and voice expectations. In management terms, US managers may assume that speaking up publicly, disagreeing openly, and showing individual initiative are positive norms.</w:t>
       </w:r>
     </w:p>
     <w:bookmarkEnd w:id="14"/>
@@ -420,15 +252,6 @@
       <w:pPr>
         <w:pStyle w:val="Heading1"/>
       </w:pPr>
-      <w:r>
-        <w:rPr>
-          <w:rStyle w:val="SectionNumber"/>
-        </w:rPr>
-        <w:t xml:space="preserve">4</w:t>
-      </w:r>
-      <w:r>
-        <w:tab/>
-      </w:r>
       <w:r>
         <w:t xml:space="preserve">3. Host culture selection</w:t>
       </w:r>
@@ -451,7 +274,7 @@
         <w:t xml:space="preserve">Japan</w:t>
       </w:r>
       <w:r>
-        <w:t xml:space="preserve">. The assignment scenario is a US Google Advertising team sending managers to Japan, so Japan is the main host environment. The business context is not tourism or general etiquette; it is Japanese corporate and client-facing advertising-platform work. The managers will interact with Google Japan colleagues, senior stakeholders, agencies, clients, and possibly multinational teams operating under Japanese business expectations (Graham &amp; Sano, 1989; Dyer &amp; Chu, 1998).</w:t>
+        <w:t xml:space="preserve">. The business context is Japanese corporate and client-facing advertising platform work. The managers will interact with Google Japan colleagues, agencies, clients, and senior stakeholders in a Japan-based commercial environment.</w:t>
       </w:r>
     </w:p>
     <w:bookmarkEnd w:id="16"/>
@@ -461,15 +284,6 @@
         <w:pStyle w:val="Heading1"/>
       </w:pPr>
       <w:r>
-        <w:rPr>
-          <w:rStyle w:val="SectionNumber"/>
-        </w:rPr>
-        <w:t xml:space="preserve">5</w:t>
-      </w:r>
-      <w:r>
-        <w:tab/>
-      </w:r>
-      <w:r>
         <w:t xml:space="preserve">4. Applying the models to the host culture: Japan</w:t>
       </w:r>
     </w:p>
@@ -479,15 +293,6 @@
         <w:pStyle w:val="Heading2"/>
       </w:pPr>
       <w:r>
-        <w:rPr>
-          <w:rStyle w:val="SectionNumber"/>
-        </w:rPr>
-        <w:t xml:space="preserve">5.1</w:t>
-      </w:r>
-      <w:r>
-        <w:tab/>
-      </w:r>
-      <w:r>
         <w:t xml:space="preserve">Hofstede</w:t>
       </w:r>
     </w:p>
@@ -496,15 +301,7 @@
         <w:pStyle w:val="FirstParagraph"/>
       </w:pPr>
       <w:r>
-        <w:t xml:space="preserve">Japan scores higher than the United States on power distance and much higher on uncertainty avoidance and long-term orientation. Classic training values are Power Distance 54, Individualism 46, Achievement/Masculinity 95, Uncertainty Avoidance 92, Long-Term Orientation 88, and Indulgence 42. The Culture Factor’s current display preserves the strongest contrasts: Japan remains very high in uncertainty avoidance and long-term orientation, and strongly achievement-oriented (Hofstede, 1984; The Culture Factor Group, n.d.).</w:t>
-      </w:r>
-    </w:p>
-    <w:p>
-      <w:pPr>
-        <w:pStyle w:val="BodyText"/>
-      </w:pPr>
-      <w:r>
-        <w:t xml:space="preserve">The management implication is that Japanese business partners may value preparation, precision, role awareness, risk control, group reliability, and reputation protection more strongly than US managers expect. High achievement does not necessarily mean aggressive individual heroics; it may appear as quality, endurance, discipline, and group responsibility (Hofstede, 1984; Smith et al., 2002).</w:t>
+        <w:t xml:space="preserve">Japan is commonly interpreted as higher than the United States in uncertainty avoidance and long-term orientation, more hierarchy-conscious, and strongly achievement-oriented. The manager implication is that preparation, precision, stakeholder approval, quality, risk control, and reputation protection matter strongly before a proposal or platform pilot is accepted.</w:t>
       </w:r>
     </w:p>
     <w:bookmarkEnd w:id="17"/>
@@ -514,15 +311,6 @@
         <w:pStyle w:val="Heading2"/>
       </w:pPr>
       <w:r>
-        <w:rPr>
-          <w:rStyle w:val="SectionNumber"/>
-        </w:rPr>
-        <w:t xml:space="preserve">5.2</w:t>
-      </w:r>
-      <w:r>
-        <w:tab/>
-      </w:r>
-      <w:r>
         <w:t xml:space="preserve">Hall</w:t>
       </w:r>
     </w:p>
@@ -531,15 +319,7 @@
         <w:pStyle w:val="FirstParagraph"/>
       </w:pPr>
       <w:r>
-        <w:t xml:space="preserve">Japan is commonly used as a high-context comparison case in intercultural communication. Meaning is often carried through context, relationship history, silence, nonverbal cues, role expectations, and indirect phrasing. A phrase such as “that may be difficult” can carry stronger negative meaning than the literal words suggest. Formality, seating, greeting, and business-card behavior can also communicate respect and hierarchy (Hall, 1976; Nishimura et al., 2008; Graham &amp; Sano, 1989).</w:t>
-      </w:r>
-    </w:p>
-    <w:p>
-      <w:pPr>
-        <w:pStyle w:val="BodyText"/>
-      </w:pPr>
-      <w:r>
-        <w:t xml:space="preserve">For Google Advertising managers, this means that a technically excellent recommendation can still fail if the manager misses indirect resistance, bypasses hierarchy, or forces public disagreement too early (Graham &amp; Sano, 1989).</w:t>
+        <w:t xml:space="preserve">Japan is commonly used as a high-context comparison case. Meaning may be carried through silence, hesitation, relationship history, role, seniority, and indirect phrasing. A phrase such as “that may be difficult” can signal stronger reservation than the literal wording suggests.</w:t>
       </w:r>
     </w:p>
     <w:bookmarkEnd w:id="18"/>
@@ -549,15 +329,6 @@
         <w:pStyle w:val="Heading2"/>
       </w:pPr>
       <w:r>
-        <w:rPr>
-          <w:rStyle w:val="SectionNumber"/>
-        </w:rPr>
-        <w:t xml:space="preserve">5.3</w:t>
-      </w:r>
-      <w:r>
-        <w:tab/>
-      </w:r>
-      <w:r>
         <w:t xml:space="preserve">Trompenaars</w:t>
       </w:r>
     </w:p>
@@ -566,34 +337,17 @@
         <w:pStyle w:val="FirstParagraph"/>
       </w:pPr>
       <w:r>
-        <w:t xml:space="preserve">Japan can be interpreted as more particularist/context-sensitive, communitarian in workplace practice, more neutral/formal in business expression, more diffuse in the relationship between role and work setting, more status-aware, and more sensitive to external context and harmony. These are tendencies, not fixed rules, and should be validated locally (Smith et al., 1995; Smith et al., 2002; Taras et al., 2010).</w:t>
-      </w:r>
-    </w:p>
-    <w:p>
-      <w:pPr>
-        <w:pStyle w:val="BodyText"/>
-      </w:pPr>
-      <w:r>
-        <w:t xml:space="preserve">The implication is that global rules must be communicated with local rationale and face-saving implementation. “This is global policy” may be factually correct but socially insufficient. Managers should explain why the policy exists, who needs to be involved, what transition path is safe, and how local risks are handled (Smith et al., 2002; Graham &amp; Sano, 1989).</w:t>
+        <w:t xml:space="preserve">Japan can be read as more context-sensitive in implementation: rules matter, but role, relationship, status, obligation, and face affect how rules are introduced and executed. A global policy can be correct and still fail socially if it ignores hierarchy or face.</w:t>
       </w:r>
     </w:p>
     <w:bookmarkEnd w:id="19"/>
-    <w:bookmarkStart w:id="20" w:name="X53d132ad6be0c20603f30d1542350c2f0abd3fc"/>
+    <w:bookmarkStart w:id="20" w:name="world-values-survey-inglehart-welzel-1"/>
     <w:p>
       <w:pPr>
         <w:pStyle w:val="Heading2"/>
       </w:pPr>
       <w:r>
-        <w:rPr>
-          <w:rStyle w:val="SectionNumber"/>
-        </w:rPr>
-        <w:t xml:space="preserve">5.4</w:t>
-      </w:r>
-      <w:r>
-        <w:tab/>
-      </w:r>
-      <w:r>
-        <w:t xml:space="preserve">World Values Survey / Inglehart-Welzel Cultural Map</w:t>
+        <w:t xml:space="preserve">World Values Survey / Inglehart-Welzel</w:t>
       </w:r>
     </w:p>
     <w:p>
@@ -601,35 +355,27 @@
         <w:pStyle w:val="FirstParagraph"/>
       </w:pPr>
       <w:r>
-        <w:t xml:space="preserve">Japan is a wealthy, technologically advanced society with secular-rational features, but business communication remains strongly shaped by harmony, order, institutional trust, role sensitivity, and restraint. The WVS lens helps prevent a simplistic “traditional Japan” stereotype while still showing that autonomy, voice, authority, and self-expression may be balanced differently than in the United States (World Values Survey Association, n.d.; Beugelsdijk &amp; Welzel, 2018).</w:t>
-      </w:r>
-    </w:p>
-    <w:p>
-      <w:pPr>
-        <w:pStyle w:val="BodyText"/>
-      </w:pPr>
-      <w:r>
-        <w:t xml:space="preserve">For training, this means managers should not expect every Japanese colleague to be indirect or hierarchy-bound. Instead, they should design channels that work across variation: direct enough for clarity, private enough for safety, and structured enough for consensus (Taras et al., 2010; Kirkman et al., 2017).</w:t>
+        <w:t xml:space="preserve">Japan is a modern, advanced society, not a simplistic “traditional” opposite of the US. The WVS lens is useful because it shows that advanced societies still differ in authority, trust, restraint, self-expression, and public voice patterns.</w:t>
       </w:r>
     </w:p>
     <w:bookmarkEnd w:id="20"/>
     <w:bookmarkEnd w:id="21"/>
-    <w:bookmarkStart w:id="22" w:name="X89cfe76b5c36b574ced4a0fcf511b02bf906c44"/>
+    <w:bookmarkStart w:id="26" w:name="thorough-comparison-between-the-cultures"/>
     <w:p>
       <w:pPr>
         <w:pStyle w:val="Heading1"/>
       </w:pPr>
       <w:r>
-        <w:rPr>
-          <w:rStyle w:val="SectionNumber"/>
-        </w:rPr>
-        <w:t xml:space="preserve">6</w:t>
-      </w:r>
-      <w:r>
-        <w:tab/>
-      </w:r>
-      <w:r>
-        <w:t xml:space="preserve">5. Thorough comparison between home and host cultures</w:t>
+        <w:t xml:space="preserve">5. Thorough comparison between the cultures</w:t>
+      </w:r>
+    </w:p>
+    <w:bookmarkStart w:id="22" w:name="hofstede-comparison"/>
+    <w:p>
+      <w:pPr>
+        <w:pStyle w:val="Heading2"/>
+      </w:pPr>
+      <w:r>
+        <w:t xml:space="preserve">Hofstede comparison</w:t>
       </w:r>
     </w:p>
     <w:p>
@@ -637,517 +383,72 @@
         <w:pStyle w:val="FirstParagraph"/>
       </w:pPr>
       <w:r>
-        <w:t xml:space="preserve">The strongest comparison points are communication, hierarchy, decision process, risk handling, trust formation, feedback, time, and accountability.</w:t>
-      </w:r>
-    </w:p>
-    <w:p>
-      <w:pPr>
-        <w:pStyle w:val="BodyText"/>
-      </w:pPr>
-      <w:r>
-        <w:t xml:space="preserve">First, the United States is more explicit and low-context, while Japan is more implicit and high-context. US managers may seek direct verbal confirmation; Japanese counterparts may communicate reservation through silence, hesitation, deferral, or indirect phrasing (Hall, 1976; Nishimura et al., 2008).</w:t>
-      </w:r>
-    </w:p>
-    <w:p>
-      <w:pPr>
-        <w:pStyle w:val="BodyText"/>
-      </w:pPr>
-      <w:r>
-        <w:t xml:space="preserve">Second, US business culture is more comfortable with accessible managers and open debate, while Japan is more rank-aware and status-sensitive. This does not mean Japanese teams lack opinions; it means the safest channel for disagreement may be private, written, or routed through local leads rather than public confrontation (Hofstede, 1984; Graham &amp; Sano, 1989).</w:t>
-      </w:r>
-    </w:p>
-    <w:p>
-      <w:pPr>
-        <w:pStyle w:val="BodyText"/>
-      </w:pPr>
-      <w:r>
-        <w:t xml:space="preserve">Third, US decision habits often move from meeting to decision to action. Japan often requires pre-alignment before a formal meeting can confirm the decision. Meyer’s course framework describes Japan as both hierarchical and consensus-minded; Graham and Sano’s negotiation work similarly emphasizes preparation and relationship-sensitive process (Graham &amp; Sano, 1989).</w:t>
-      </w:r>
-    </w:p>
-    <w:p>
-      <w:pPr>
-        <w:pStyle w:val="BodyText"/>
-      </w:pPr>
-      <w:r>
-        <w:t xml:space="preserve">Fourth, uncertainty avoidance is a major difference. US platform culture may normalize pilots, tests, and optimization cycles. Japanese stakeholders may expect more proof, QA, stakeholder approval, and fallback planning before they commit budget or reputation to an advertising-space recommendation (Hofstede, 1984; The Culture Factor Group, n.d.; Taras et al., 2010).</w:t>
-      </w:r>
-    </w:p>
-    <w:p>
-      <w:pPr>
-        <w:pStyle w:val="BodyText"/>
-      </w:pPr>
-      <w:r>
-        <w:t xml:space="preserve">Fifth, trust formation differs. US managers may assume Google’s brand, technical expertise, and a strong business case create trust. Japanese relationships may require repeated reliability, careful follow-up, continuity, and fairness before full trust forms. Dyer and Chu’s research on supplier relationships in Japan and the US supports the importance of trust mechanisms beyond formal contract logic (Dyer &amp; Chu, 1998).</w:t>
-      </w:r>
-    </w:p>
-    <w:p>
-      <w:pPr>
-        <w:pStyle w:val="BodyText"/>
-      </w:pPr>
-      <w:r>
-        <w:t xml:space="preserve">Sixth, accountability differs. US managers may ask who owns the outcome. Japanese counterparts may interpret outcomes through process, team, role, client constraints, and external dependencies. Smith, Trompenaars, and Dugan show that locus-of-control constructs themselves are culturally sensitive, which supports a more careful approach to responsibility language (Smith et al., 1995).</w:t>
+        <w:t xml:space="preserve">The strongest practical difference is uncertainty avoidance. US platform culture may normalize testing and optimization; Japanese stakeholders may need clearer safeguards before accepting a platform pilot or advertising-space recommendation. Japan’s higher long-term orientation also means that short-term performance arguments should be paired with trust, continuity, and reputation logic.</w:t>
       </w:r>
     </w:p>
     <w:bookmarkEnd w:id="22"/>
-    <w:bookmarkStart w:id="30" w:name="X84e7879d164a949b0505b2693a1b0c91210290c"/>
+    <w:bookmarkStart w:id="23" w:name="hall-comparison"/>
+    <w:p>
+      <w:pPr>
+        <w:pStyle w:val="Heading2"/>
+      </w:pPr>
+      <w:r>
+        <w:t xml:space="preserve">Hall comparison</w:t>
+      </w:r>
+    </w:p>
+    <w:p>
+      <w:pPr>
+        <w:pStyle w:val="FirstParagraph"/>
+      </w:pPr>
+      <w:r>
+        <w:t xml:space="preserve">The US side expects explicit messages; the Japan side may encode meaning in context. Therefore, US managers must not treat silence as consent. They should ask concern-oriented questions and verify agreement privately when hierarchy is present.</w:t>
+      </w:r>
+    </w:p>
+    <w:bookmarkEnd w:id="23"/>
+    <w:bookmarkStart w:id="24" w:name="trompenaars-comparison"/>
+    <w:p>
+      <w:pPr>
+        <w:pStyle w:val="Heading2"/>
+      </w:pPr>
+      <w:r>
+        <w:t xml:space="preserve">Trompenaars comparison</w:t>
+      </w:r>
+    </w:p>
+    <w:p>
+      <w:pPr>
+        <w:pStyle w:val="FirstParagraph"/>
+      </w:pPr>
+      <w:r>
+        <w:t xml:space="preserve">US universalist/specific logic says: “the rule, owner, and KPI are clear.” Japan-sensitive implementation asks: “who must be aligned, how is face preserved, and how does the rule fit the relationship context?” This is not abandoning rules; it is making rules operational in context.</w:t>
+      </w:r>
+    </w:p>
+    <w:bookmarkEnd w:id="24"/>
+    <w:bookmarkStart w:id="25" w:name="wvs-inglehart-welzel-comparison"/>
+    <w:p>
+      <w:pPr>
+        <w:pStyle w:val="Heading2"/>
+      </w:pPr>
+      <w:r>
+        <w:t xml:space="preserve">WVS / Inglehart-Welzel comparison</w:t>
+      </w:r>
+    </w:p>
+    <w:p>
+      <w:pPr>
+        <w:pStyle w:val="FirstParagraph"/>
+      </w:pPr>
+      <w:r>
+        <w:t xml:space="preserve">The US assumption that public voice and autonomy are always safe may not transfer cleanly. In Japan, input may need structured channels: pre-reads, 1:1s, written comments, senior-sponsor alignment, or smaller meetings.</w:t>
+      </w:r>
+    </w:p>
+    <w:bookmarkEnd w:id="25"/>
+    <w:bookmarkEnd w:id="26"/>
+    <w:bookmarkStart w:id="27" w:name="Xdc30686185f98a4ecf8aa0f509937089b7dfe2a"/>
     <w:p>
       <w:pPr>
         <w:pStyle w:val="Heading1"/>
       </w:pPr>
       <w:r>
-        <w:rPr>
-          <w:rStyle w:val="SectionNumber"/>
-        </w:rPr>
-        <w:t xml:space="preserve">7</w:t>
-      </w:r>
-      <w:r>
-        <w:tab/>
-      </w:r>
-      <w:r>
-        <w:t xml:space="preserve">6. Potential problem areas in this specific constellation</w:t>
-      </w:r>
-    </w:p>
-    <w:bookmarkStart w:id="23" w:name="X3b5473d37d736178fb4cceb8c1c4ee73ce178ca"/>
-    <w:p>
-      <w:pPr>
-        <w:pStyle w:val="Heading2"/>
-      </w:pPr>
-      <w:r>
-        <w:rPr>
-          <w:rStyle w:val="SectionNumber"/>
-        </w:rPr>
-        <w:t xml:space="preserve">7.1</w:t>
-      </w:r>
-      <w:r>
-        <w:tab/>
-      </w:r>
-      <w:r>
-        <w:t xml:space="preserve">Problem area 1: Misreading indirect communication</w:t>
-      </w:r>
-    </w:p>
-    <w:p>
-      <w:pPr>
-        <w:pStyle w:val="FirstParagraph"/>
-      </w:pPr>
-      <w:r>
-        <w:t xml:space="preserve">A US Google manager may hear “we will consider it” as neutral interest, while a Japanese counterpart may be signaling concern. The risk is that the manager proceeds as if agreement exists, creating later resistance or embarrassment (Hall, 1976; Nishimura et al., 2008).</w:t>
-      </w:r>
-    </w:p>
-    <w:bookmarkEnd w:id="23"/>
-    <w:bookmarkStart w:id="24" w:name="X4f83fa5ae91a5e34b5f252add99f9fb52fd0c20"/>
-    <w:p>
-      <w:pPr>
-        <w:pStyle w:val="Heading2"/>
-      </w:pPr>
-      <w:r>
-        <w:rPr>
-          <w:rStyle w:val="SectionNumber"/>
-        </w:rPr>
-        <w:t xml:space="preserve">7.2</w:t>
-      </w:r>
-      <w:r>
-        <w:tab/>
-      </w:r>
-      <w:r>
-        <w:t xml:space="preserve">Problem area 2: Forcing decisions in the meeting</w:t>
-      </w:r>
-    </w:p>
-    <w:p>
-      <w:pPr>
-        <w:pStyle w:val="FirstParagraph"/>
-      </w:pPr>
-      <w:r>
-        <w:t xml:space="preserve">A US manager may expect a proposal meeting to end with a clear yes/no. In Japan, the meeting may be a visible step in a longer pre-alignment process. If the manager pushes too hard, senior stakeholders may feel cornered and junior colleagues may become silent (Graham &amp; Sano, 1989; Hofstede, 1984).</w:t>
-      </w:r>
-    </w:p>
-    <w:bookmarkEnd w:id="24"/>
-    <w:bookmarkStart w:id="25" w:name="Xb026ad60267eed4c3f5c40a0e1d835b4eafee5d"/>
-    <w:p>
-      <w:pPr>
-        <w:pStyle w:val="Heading2"/>
-      </w:pPr>
-      <w:r>
-        <w:rPr>
-          <w:rStyle w:val="SectionNumber"/>
-        </w:rPr>
-        <w:t xml:space="preserve">7.3</w:t>
-      </w:r>
-      <w:r>
-        <w:tab/>
-      </w:r>
-      <w:r>
-        <w:t xml:space="preserve">Problem area 3: Treating platform pilots like casual experiments</w:t>
-      </w:r>
-    </w:p>
-    <w:p>
-      <w:pPr>
-        <w:pStyle w:val="FirstParagraph"/>
-      </w:pPr>
-      <w:r>
-        <w:t xml:space="preserve">Google’s advertising solutions often improve through testing and optimization. In Japan, a pilot may still be seen as a reputational risk if the rationale, quality control, budget cap, and rollback path are unclear. This is especially relevant because Google is selling advertising space and platform solutions, so clients may attribute poor outcomes to Google’s recommendation quality (Hofstede, 1984; The Culture Factor Group, n.d.).</w:t>
-      </w:r>
-    </w:p>
-    <w:bookmarkEnd w:id="25"/>
-    <w:bookmarkStart w:id="26" w:name="problem-area-4-public-direct-feedback"/>
-    <w:p>
-      <w:pPr>
-        <w:pStyle w:val="Heading2"/>
-      </w:pPr>
-      <w:r>
-        <w:rPr>
-          <w:rStyle w:val="SectionNumber"/>
-        </w:rPr>
-        <w:t xml:space="preserve">7.4</w:t>
-      </w:r>
-      <w:r>
-        <w:tab/>
-      </w:r>
-      <w:r>
-        <w:t xml:space="preserve">Problem area 4: Public direct feedback</w:t>
-      </w:r>
-    </w:p>
-    <w:p>
-      <w:pPr>
-        <w:pStyle w:val="FirstParagraph"/>
-      </w:pPr>
-      <w:r>
-        <w:t xml:space="preserve">Direct negative feedback may be intended as efficient, but in Japan it can threaten face and status. Saying “this proposal is wrong” in a group setting can damage trust and reduce information flow (Hall, 1976; Graham &amp; Sano, 1989).</w:t>
-      </w:r>
-    </w:p>
-    <w:bookmarkEnd w:id="26"/>
-    <w:bookmarkStart w:id="27" w:name="X815e305606f9c0763e26e62ef537983bcdc6c00"/>
-    <w:p>
-      <w:pPr>
-        <w:pStyle w:val="Heading2"/>
-      </w:pPr>
-      <w:r>
-        <w:rPr>
-          <w:rStyle w:val="SectionNumber"/>
-        </w:rPr>
-        <w:t xml:space="preserve">7.5</w:t>
-      </w:r>
-      <w:r>
-        <w:tab/>
-      </w:r>
-      <w:r>
-        <w:t xml:space="preserve">Problem area 5: Individual blame after weak client outcomes</w:t>
-      </w:r>
-    </w:p>
-    <w:p>
-      <w:pPr>
-        <w:pStyle w:val="FirstParagraph"/>
-      </w:pPr>
-      <w:r>
-        <w:t xml:space="preserve">If an ad-space recommendation performs poorly or a client hesitates, US managers may over-personalize the outcome. Japanese teams may expect analysis of process, market context, approval flow, client constraints, and group responsibility (Smith et al., 1995; Smith et al., 2002).</w:t>
-      </w:r>
-    </w:p>
-    <w:bookmarkEnd w:id="27"/>
-    <w:bookmarkStart w:id="28" w:name="X66fe32c8c549eb59fbd78b18301cae389f9614f"/>
-    <w:p>
-      <w:pPr>
-        <w:pStyle w:val="Heading2"/>
-      </w:pPr>
-      <w:r>
-        <w:rPr>
-          <w:rStyle w:val="SectionNumber"/>
-        </w:rPr>
-        <w:t xml:space="preserve">7.6</w:t>
-      </w:r>
-      <w:r>
-        <w:tab/>
-      </w:r>
-      <w:r>
-        <w:t xml:space="preserve">Problem area 6: Over-reliance on short-term metrics</w:t>
-      </w:r>
-    </w:p>
-    <w:p>
-      <w:pPr>
-        <w:pStyle w:val="FirstParagraph"/>
-      </w:pPr>
-      <w:r>
-        <w:t xml:space="preserve">US managers may emphasize short-term performance metrics and optimization velocity. Japanese stakeholders may need a stronger long-term argument: brand safety, trust, learning, continuity, and client reputation (Hofstede, 1984; Dyer &amp; Chu, 1998).</w:t>
-      </w:r>
-    </w:p>
-    <w:bookmarkEnd w:id="28"/>
-    <w:bookmarkStart w:id="29" w:name="X70be65df2da919dafd57a90992df9a24c5e458c"/>
-    <w:p>
-      <w:pPr>
-        <w:pStyle w:val="Heading2"/>
-      </w:pPr>
-      <w:r>
-        <w:rPr>
-          <w:rStyle w:val="SectionNumber"/>
-        </w:rPr>
-        <w:t xml:space="preserve">7.7</w:t>
-      </w:r>
-      <w:r>
-        <w:tab/>
-      </w:r>
-      <w:r>
-        <w:t xml:space="preserve">Problem area 7: Incorrect use of Google brand cues</w:t>
-      </w:r>
-    </w:p>
-    <w:p>
-      <w:pPr>
-        <w:pStyle w:val="FirstParagraph"/>
-      </w:pPr>
-      <w:r>
-        <w:t xml:space="preserve">Because the managers represent Google, visual and verbal accuracy matters. Training materials should not modify the Google logo, imply endorsement where it is not relevant, or blur Google’s role. This report and presentation use plain-text Google references and color accents rather than modified marks (Google Partner Marketing Hub, n.d.).</w:t>
-      </w:r>
-    </w:p>
-    <w:bookmarkEnd w:id="29"/>
-    <w:bookmarkEnd w:id="30"/>
-    <w:bookmarkStart w:id="39" w:name="detailed-recommended-guideline"/>
-    <w:p>
-      <w:pPr>
-        <w:pStyle w:val="Heading1"/>
-      </w:pPr>
-      <w:r>
-        <w:rPr>
-          <w:rStyle w:val="SectionNumber"/>
-        </w:rPr>
-        <w:t xml:space="preserve">8</w:t>
-      </w:r>
-      <w:r>
-        <w:tab/>
-      </w:r>
-      <w:r>
-        <w:t xml:space="preserve">7. Detailed recommended guideline</w:t>
-      </w:r>
-    </w:p>
-    <w:bookmarkStart w:id="31" w:name="Xa46820513164bc7c68f2f4b2bc7470639acb84b"/>
-    <w:p>
-      <w:pPr>
-        <w:pStyle w:val="Heading2"/>
-      </w:pPr>
-      <w:r>
-        <w:rPr>
-          <w:rStyle w:val="SectionNumber"/>
-        </w:rPr>
-        <w:t xml:space="preserve">8.1</w:t>
-      </w:r>
-      <w:r>
-        <w:tab/>
-      </w:r>
-      <w:r>
-        <w:t xml:space="preserve">Guideline A: Use “context-first” communication</w:t>
-      </w:r>
-    </w:p>
-    <w:p>
-      <w:pPr>
-        <w:pStyle w:val="FirstParagraph"/>
-      </w:pPr>
-      <w:r>
-        <w:t xml:space="preserve">Before giving a recommendation, state the context, client situation, risk, and stakeholder effect. Replace “Here is what we should do” with “Here is the client context, the risk boundary, the proposed path, and what we need to confirm locally.” This adapts US clarity to Japanese context sensitivity (Hall, 1976; Nishimura et al., 2008).</w:t>
-      </w:r>
-    </w:p>
-    <w:bookmarkEnd w:id="31"/>
-    <w:bookmarkStart w:id="32" w:name="X896d430eda9ae20c763a65fb73daab84669e3e0"/>
-    <w:p>
-      <w:pPr>
-        <w:pStyle w:val="Heading2"/>
-      </w:pPr>
-      <w:r>
-        <w:rPr>
-          <w:rStyle w:val="SectionNumber"/>
-        </w:rPr>
-        <w:t xml:space="preserve">8.2</w:t>
-      </w:r>
-      <w:r>
-        <w:tab/>
-      </w:r>
-      <w:r>
-        <w:t xml:space="preserve">Guideline B: Build nemawashi into the operating rhythm</w:t>
-      </w:r>
-    </w:p>
-    <w:p>
-      <w:pPr>
-        <w:pStyle w:val="FirstParagraph"/>
-      </w:pPr>
-      <w:r>
-        <w:t xml:space="preserve">For important ad-space proposals or platform changes, do not wait for the formal meeting. Identify the formal decision-maker, informal influencers, implementation owners, and risk holders. Share the rationale early and resolve objections before the meeting. The meeting should confirm alignment, not create surprise (Graham &amp; Sano, 1989; Hofstede, 1984).</w:t>
-      </w:r>
-    </w:p>
-    <w:bookmarkEnd w:id="32"/>
-    <w:bookmarkStart w:id="33" w:name="Xe5ce2f01a6445fb919d60d2cc6bd675740afe35"/>
-    <w:p>
-      <w:pPr>
-        <w:pStyle w:val="Heading2"/>
-      </w:pPr>
-      <w:r>
-        <w:rPr>
-          <w:rStyle w:val="SectionNumber"/>
-        </w:rPr>
-        <w:t xml:space="preserve">8.3</w:t>
-      </w:r>
-      <w:r>
-        <w:tab/>
-      </w:r>
-      <w:r>
-        <w:t xml:space="preserve">Guideline C: Make pilots safe before making them fast</w:t>
-      </w:r>
-    </w:p>
-    <w:p>
-      <w:pPr>
-        <w:pStyle w:val="FirstParagraph"/>
-      </w:pPr>
-      <w:r>
-        <w:t xml:space="preserve">Every client-facing pilot should include: business rationale, scope, budget cap, brand-safety/quality checklist, owner, stakeholder sign-off, reporting cadence, escalation trigger, and fallback path. This keeps the US test-and-learn logic but makes it credible in a high-uncertainty-avoidance environment (Hofstede, 1984; Taras et al., 2010; The Culture Factor Group, n.d.).</w:t>
-      </w:r>
-    </w:p>
-    <w:bookmarkEnd w:id="33"/>
-    <w:bookmarkStart w:id="34" w:name="X96ad004e1441828c404907876bcd1a06d5dca4d"/>
-    <w:p>
-      <w:pPr>
-        <w:pStyle w:val="Heading2"/>
-      </w:pPr>
-      <w:r>
-        <w:rPr>
-          <w:rStyle w:val="SectionNumber"/>
-        </w:rPr>
-        <w:t xml:space="preserve">8.4</w:t>
-      </w:r>
-      <w:r>
-        <w:tab/>
-      </w:r>
-      <w:r>
-        <w:t xml:space="preserve">Guideline D: Use private, data-first feedback</w:t>
-      </w:r>
-    </w:p>
-    <w:p>
-      <w:pPr>
-        <w:pStyle w:val="FirstParagraph"/>
-      </w:pPr>
-      <w:r>
-        <w:t xml:space="preserve">Correct privately, not publicly. Begin with shared data: “The data suggests this approach creates a risk. How do you see it?” This preserves dignity while still addressing performance. Use problem/process language rather than person/blame language (Hall, 1976; Graham &amp; Sano, 1989).</w:t>
-      </w:r>
-    </w:p>
-    <w:bookmarkEnd w:id="34"/>
-    <w:bookmarkStart w:id="35" w:name="X9ed90b71a7a83044fe7832be54721e2e1c5cbff"/>
-    <w:p>
-      <w:pPr>
-        <w:pStyle w:val="Heading2"/>
-      </w:pPr>
-      <w:r>
-        <w:rPr>
-          <w:rStyle w:val="SectionNumber"/>
-        </w:rPr>
-        <w:t xml:space="preserve">8.5</w:t>
-      </w:r>
-      <w:r>
-        <w:tab/>
-      </w:r>
-      <w:r>
-        <w:t xml:space="preserve">Guideline E: Translate accountability into three buckets</w:t>
-      </w:r>
-    </w:p>
-    <w:p>
-      <w:pPr>
-        <w:pStyle w:val="FirstParagraph"/>
-      </w:pPr>
-      <w:r>
-        <w:t xml:space="preserve">For weak outcomes, use three buckets: individual owner, team/process cause, external dependency. This preserves US ownership without creating public blame. It also recognizes that outcomes in platform advertising depend on client readiness, market context, approval processes, measurement quality, creative quality, and platform mechanics (Smith et al., 1995; Smith et al., 2002).</w:t>
-      </w:r>
-    </w:p>
-    <w:bookmarkEnd w:id="35"/>
-    <w:bookmarkStart w:id="36" w:name="X1dec2b38a06d237d61cf507accad3c4a8508a32"/>
-    <w:p>
-      <w:pPr>
-        <w:pStyle w:val="Heading2"/>
-      </w:pPr>
-      <w:r>
-        <w:rPr>
-          <w:rStyle w:val="SectionNumber"/>
-        </w:rPr>
-        <w:t xml:space="preserve">8.6</w:t>
-      </w:r>
-      <w:r>
-        <w:tab/>
-      </w:r>
-      <w:r>
-        <w:t xml:space="preserve">Guideline F: Lead with respect before expertise</w:t>
-      </w:r>
-    </w:p>
-    <w:p>
-      <w:pPr>
-        <w:pStyle w:val="FirstParagraph"/>
-      </w:pPr>
-      <w:r>
-        <w:t xml:space="preserve">A young or newly arrived US manager may have strong technical expertise, but status and seniority still matter in Japan. Start by respecting local roles, seniority, and context. Then introduce expertise as support for the local decision process, not as a shortcut around it (Hofstede, 1984; Graham &amp; Sano, 1989).</w:t>
-      </w:r>
-    </w:p>
-    <w:bookmarkEnd w:id="36"/>
-    <w:bookmarkStart w:id="37" w:name="X95b33754f24ee982856f25ea5d64f5c8fc2e74d"/>
-    <w:p>
-      <w:pPr>
-        <w:pStyle w:val="Heading2"/>
-      </w:pPr>
-      <w:r>
-        <w:rPr>
-          <w:rStyle w:val="SectionNumber"/>
-        </w:rPr>
-        <w:t xml:space="preserve">8.7</w:t>
-      </w:r>
-      <w:r>
-        <w:tab/>
-      </w:r>
-      <w:r>
-        <w:t xml:space="preserve">Guideline G: Treat reliability as trust-building</w:t>
-      </w:r>
-    </w:p>
-    <w:p>
-      <w:pPr>
-        <w:pStyle w:val="FirstParagraph"/>
-      </w:pPr>
-      <w:r>
-        <w:t xml:space="preserve">Punctuality, preparation, accurate notes, exact follow-up, and promise-keeping should be treated as strategic trust behaviors. In Japan, these details signal reliability and seriousness. Trust is built through repeated, consistent behavior, not only through credentials or a strong deck (Dyer &amp; Chu, 1998).</w:t>
-      </w:r>
-    </w:p>
-    <w:bookmarkEnd w:id="37"/>
-    <w:bookmarkStart w:id="38" w:name="X8d4f2c6034b7ad303eaa9b213d5e1e5b75f6495"/>
-    <w:p>
-      <w:pPr>
-        <w:pStyle w:val="Heading2"/>
-      </w:pPr>
-      <w:r>
-        <w:rPr>
-          <w:rStyle w:val="SectionNumber"/>
-        </w:rPr>
-        <w:t xml:space="preserve">8.8</w:t>
-      </w:r>
-      <w:r>
-        <w:tab/>
-      </w:r>
-      <w:r>
-        <w:t xml:space="preserve">Guideline H: Use models as hypotheses, not labels</w:t>
-      </w:r>
-    </w:p>
-    <w:p>
-      <w:pPr>
-        <w:pStyle w:val="FirstParagraph"/>
-      </w:pPr>
-      <w:r>
-        <w:t xml:space="preserve">Every training participant should ask: “Is this pattern relevant here, or does Google Japan work differently?” National culture models are useful for preparation, but they do not predict every individual or organization. This is especially important inside multinational technology companies where people may be bicultural or globally trained (Taras et al., 2010; Kirkman et al., 2017; Beugelsdijk &amp; Welzel, 2018).</w:t>
-      </w:r>
-    </w:p>
-    <w:bookmarkEnd w:id="38"/>
-    <w:bookmarkEnd w:id="39"/>
-    <w:bookmarkStart w:id="40" w:name="training-ready-final-checklist"/>
-    <w:p>
-      <w:pPr>
-        <w:pStyle w:val="Heading1"/>
-      </w:pPr>
-      <w:r>
-        <w:rPr>
-          <w:rStyle w:val="SectionNumber"/>
-        </w:rPr>
-        <w:t xml:space="preserve">9</w:t>
-      </w:r>
-      <w:r>
-        <w:tab/>
-      </w:r>
-      <w:r>
-        <w:t xml:space="preserve">Training-ready final checklist</w:t>
+        <w:t xml:space="preserve">6. Potential problem areas in this constellation</w:t>
       </w:r>
     </w:p>
     <w:p>
@@ -1159,10 +460,14 @@
         </w:numPr>
       </w:pPr>
       <w:r>
-        <w:t xml:space="preserve">Identify stakeholder hierarchy before the meeting (Hofstede, 1984; Graham &amp; Sano, 1989).</w:t>
-      </w:r>
-      <w:r>
-        <w:br/>
+        <w:rPr>
+          <w:b/>
+          <w:bCs/>
+        </w:rPr>
+        <w:t xml:space="preserve">Platform pilots feel under-controlled</w:t>
+      </w:r>
+      <w:r>
+        <w:t xml:space="preserve">: Hofstede’s uncertainty avoidance lens predicts discomfort with vague test-and-learn proposals.</w:t>
       </w:r>
     </w:p>
     <w:p>
@@ -1174,10 +479,14 @@
         </w:numPr>
       </w:pPr>
       <w:r>
-        <w:t xml:space="preserve">Send rationale and risk controls before the meeting (Graham &amp; Sano, 1989).</w:t>
-      </w:r>
-      <w:r>
-        <w:br/>
+        <w:rPr>
+          <w:b/>
+          <w:bCs/>
+        </w:rPr>
+        <w:t xml:space="preserve">Indirect concerns are misread</w:t>
+      </w:r>
+      <w:r>
+        <w:t xml:space="preserve">: Hall’s context lens predicts that US managers may miss reservation expressed indirectly.</w:t>
       </w:r>
     </w:p>
     <w:p>
@@ -1189,10 +498,14 @@
         </w:numPr>
       </w:pPr>
       <w:r>
-        <w:t xml:space="preserve">Never treat silence as consent (Hall, 1976; Nishimura et al., 2008).</w:t>
-      </w:r>
-      <w:r>
-        <w:br/>
+        <w:rPr>
+          <w:b/>
+          <w:bCs/>
+        </w:rPr>
+        <w:t xml:space="preserve">Global rules are introduced too bluntly</w:t>
+      </w:r>
+      <w:r>
+        <w:t xml:space="preserve">: Trompenaars predicts friction if universalist policy logic ignores role, relationship, and face.</w:t>
       </w:r>
     </w:p>
     <w:p>
@@ -1204,10 +517,14 @@
         </w:numPr>
       </w:pPr>
       <w:r>
-        <w:t xml:space="preserve">Ask for concerns indirectly and privately (Hall, 1976; Graham &amp; Sano, 1989).</w:t>
-      </w:r>
-      <w:r>
-        <w:br/>
+        <w:rPr>
+          <w:b/>
+          <w:bCs/>
+        </w:rPr>
+        <w:t xml:space="preserve">Public voice is requested in the wrong channel</w:t>
+      </w:r>
+      <w:r>
+        <w:t xml:space="preserve">: WVS predicts that autonomy and disagreement need culturally safe expression channels.</w:t>
       </w:r>
     </w:p>
     <w:p>
@@ -1219,10 +536,14 @@
         </w:numPr>
       </w:pPr>
       <w:r>
-        <w:t xml:space="preserve">Frame ad-space recommendations as controlled proposals, not casual experiments (Hofstede, 1984; The Culture Factor Group, n.d.).</w:t>
-      </w:r>
-      <w:r>
-        <w:br/>
+        <w:rPr>
+          <w:b/>
+          <w:bCs/>
+        </w:rPr>
+        <w:t xml:space="preserve">Short-term performance framing is too narrow</w:t>
+      </w:r>
+      <w:r>
+        <w:t xml:space="preserve">: Hofstede’s long-term orientation lens suggests the need to include reputation, continuity, and quality.</w:t>
       </w:r>
     </w:p>
     <w:p>
@@ -1234,10 +555,55 @@
         </w:numPr>
       </w:pPr>
       <w:r>
-        <w:t xml:space="preserve">Use brand-safety and rollback language in pilots (Hofstede, 1984; Google Partner Marketing Hub, n.d.).</w:t>
-      </w:r>
-      <w:r>
-        <w:br/>
+        <w:rPr>
+          <w:b/>
+          <w:bCs/>
+        </w:rPr>
+        <w:t xml:space="preserve">Corrective feedback is too direct or public</w:t>
+      </w:r>
+      <w:r>
+        <w:t xml:space="preserve">: Hall and Hofstede together suggest that face and hierarchy must be protected.</w:t>
+      </w:r>
+    </w:p>
+    <w:bookmarkEnd w:id="27"/>
+    <w:bookmarkStart w:id="33" w:name="recommended-guideline"/>
+    <w:p>
+      <w:pPr>
+        <w:pStyle w:val="Heading1"/>
+      </w:pPr>
+      <w:r>
+        <w:t xml:space="preserve">7. Recommended guideline</w:t>
+      </w:r>
+    </w:p>
+    <w:bookmarkStart w:id="28" w:name="operating-principle"/>
+    <w:p>
+      <w:pPr>
+        <w:pStyle w:val="Heading2"/>
+      </w:pPr>
+      <w:r>
+        <w:t xml:space="preserve">Operating principle</w:t>
+      </w:r>
+    </w:p>
+    <w:p>
+      <w:pPr>
+        <w:pStyle w:val="FirstParagraph"/>
+      </w:pPr>
+      <w:r>
+        <w:rPr>
+          <w:b/>
+          <w:bCs/>
+        </w:rPr>
+        <w:t xml:space="preserve">Make US speed legible as Japanese-quality control.</w:t>
+      </w:r>
+    </w:p>
+    <w:bookmarkEnd w:id="28"/>
+    <w:bookmarkStart w:id="29" w:name="before-the-meeting"/>
+    <w:p>
+      <w:pPr>
+        <w:pStyle w:val="Heading2"/>
+      </w:pPr>
+      <w:r>
+        <w:t xml:space="preserve">Before the meeting</w:t>
       </w:r>
     </w:p>
     <w:p>
@@ -1245,14 +611,11 @@
         <w:pStyle w:val="Compact"/>
         <w:numPr>
           <w:ilvl w:val="0"/>
-          <w:numId w:val="1001"/>
+          <w:numId w:val="1002"/>
         </w:numPr>
       </w:pPr>
       <w:r>
-        <w:t xml:space="preserve">Give corrective feedback privately and data-first (Hall, 1976; Graham &amp; Sano, 1989).</w:t>
-      </w:r>
-      <w:r>
-        <w:br/>
+        <w:t xml:space="preserve">Map formal decision-makers, informal influencers, implementation owners, and risk holders.</w:t>
       </w:r>
     </w:p>
     <w:p>
@@ -1260,14 +623,11 @@
         <w:pStyle w:val="Compact"/>
         <w:numPr>
           <w:ilvl w:val="0"/>
-          <w:numId w:val="1001"/>
+          <w:numId w:val="1002"/>
         </w:numPr>
       </w:pPr>
       <w:r>
-        <w:t xml:space="preserve">Separate individual accountability from public blame (Smith et al., 1995).</w:t>
-      </w:r>
-      <w:r>
-        <w:br/>
+        <w:t xml:space="preserve">Send a pre-read that includes rationale, scope, risk boundary, quality checks, and questions for feedback.</w:t>
       </w:r>
     </w:p>
     <w:p>
@@ -1275,14 +635,21 @@
         <w:pStyle w:val="Compact"/>
         <w:numPr>
           <w:ilvl w:val="0"/>
-          <w:numId w:val="1001"/>
+          <w:numId w:val="1002"/>
         </w:numPr>
       </w:pPr>
       <w:r>
-        <w:t xml:space="preserve">Build trust through reliability and continuity (Dyer &amp; Chu, 1998).</w:t>
-      </w:r>
-      <w:r>
-        <w:br/>
+        <w:t xml:space="preserve">Identify where disagreement can surface safely.</w:t>
+      </w:r>
+    </w:p>
+    <w:bookmarkEnd w:id="29"/>
+    <w:bookmarkStart w:id="30" w:name="during-the-meeting"/>
+    <w:p>
+      <w:pPr>
+        <w:pStyle w:val="Heading2"/>
+      </w:pPr>
+      <w:r>
+        <w:t xml:space="preserve">During the meeting</w:t>
       </w:r>
     </w:p>
     <w:p>
@@ -1290,28 +657,148 @@
         <w:pStyle w:val="Compact"/>
         <w:numPr>
           <w:ilvl w:val="0"/>
-          <w:numId w:val="1001"/>
+          <w:numId w:val="1003"/>
         </w:numPr>
       </w:pPr>
       <w:r>
-        <w:t xml:space="preserve">Validate cultural hypotheses with local colleagues (Taras et al., 2010; Kirkman et al., 2017).</w:t>
-      </w:r>
-    </w:p>
-    <w:bookmarkEnd w:id="40"/>
-    <w:bookmarkStart w:id="41" w:name="references"/>
+        <w:t xml:space="preserve">Listen for silence, hesitation, deferral, and indirect phrasing.</w:t>
+      </w:r>
+    </w:p>
+    <w:p>
+      <w:pPr>
+        <w:pStyle w:val="Compact"/>
+        <w:numPr>
+          <w:ilvl w:val="0"/>
+          <w:numId w:val="1003"/>
+        </w:numPr>
+      </w:pPr>
+      <w:r>
+        <w:t xml:space="preserve">Ask concern-based questions: “What risks should we resolve before moving forward?”</w:t>
+      </w:r>
+    </w:p>
+    <w:p>
+      <w:pPr>
+        <w:pStyle w:val="Compact"/>
+        <w:numPr>
+          <w:ilvl w:val="0"/>
+          <w:numId w:val="1003"/>
+        </w:numPr>
+      </w:pPr>
+      <w:r>
+        <w:t xml:space="preserve">Avoid forcing junior people to disagree publicly with senior people.</w:t>
+      </w:r>
+    </w:p>
+    <w:bookmarkEnd w:id="30"/>
+    <w:bookmarkStart w:id="31" w:name="after-the-meeting"/>
+    <w:p>
+      <w:pPr>
+        <w:pStyle w:val="Heading2"/>
+      </w:pPr>
+      <w:r>
+        <w:t xml:space="preserve">After the meeting</w:t>
+      </w:r>
+    </w:p>
+    <w:p>
+      <w:pPr>
+        <w:pStyle w:val="Compact"/>
+        <w:numPr>
+          <w:ilvl w:val="0"/>
+          <w:numId w:val="1004"/>
+        </w:numPr>
+      </w:pPr>
+      <w:r>
+        <w:t xml:space="preserve">Send a precise written summary.</w:t>
+      </w:r>
+    </w:p>
+    <w:p>
+      <w:pPr>
+        <w:pStyle w:val="Compact"/>
+        <w:numPr>
+          <w:ilvl w:val="0"/>
+          <w:numId w:val="1004"/>
+        </w:numPr>
+      </w:pPr>
+      <w:r>
+        <w:t xml:space="preserve">Confirm approval path, owners, reporting cadence, and fallback triggers.</w:t>
+      </w:r>
+    </w:p>
+    <w:p>
+      <w:pPr>
+        <w:pStyle w:val="Compact"/>
+        <w:numPr>
+          <w:ilvl w:val="0"/>
+          <w:numId w:val="1004"/>
+        </w:numPr>
+      </w:pPr>
+      <w:r>
+        <w:t xml:space="preserve">Treat platform pilots as controlled recommendations, not casual experiments.</w:t>
+      </w:r>
+    </w:p>
+    <w:bookmarkEnd w:id="31"/>
+    <w:bookmarkStart w:id="32" w:name="final-manager-checklist"/>
+    <w:p>
+      <w:pPr>
+        <w:pStyle w:val="Heading2"/>
+      </w:pPr>
+      <w:r>
+        <w:t xml:space="preserve">Final manager checklist</w:t>
+      </w:r>
+    </w:p>
+    <w:p>
+      <w:pPr>
+        <w:pStyle w:val="Compact"/>
+        <w:numPr>
+          <w:ilvl w:val="0"/>
+          <w:numId w:val="1005"/>
+        </w:numPr>
+      </w:pPr>
+      <w:r>
+        <w:t xml:space="preserve">Hofstede: Have we made uncertainty and risk controllable?</w:t>
+      </w:r>
+    </w:p>
+    <w:p>
+      <w:pPr>
+        <w:pStyle w:val="Compact"/>
+        <w:numPr>
+          <w:ilvl w:val="0"/>
+          <w:numId w:val="1005"/>
+        </w:numPr>
+      </w:pPr>
+      <w:r>
+        <w:t xml:space="preserve">Hall: Have we checked what was implied, not only what was said?</w:t>
+      </w:r>
+    </w:p>
+    <w:p>
+      <w:pPr>
+        <w:pStyle w:val="Compact"/>
+        <w:numPr>
+          <w:ilvl w:val="0"/>
+          <w:numId w:val="1005"/>
+        </w:numPr>
+      </w:pPr>
+      <w:r>
+        <w:t xml:space="preserve">Trompenaars: Have we introduced rules through the right role/context channel?</w:t>
+      </w:r>
+    </w:p>
+    <w:p>
+      <w:pPr>
+        <w:pStyle w:val="Compact"/>
+        <w:numPr>
+          <w:ilvl w:val="0"/>
+          <w:numId w:val="1005"/>
+        </w:numPr>
+      </w:pPr>
+      <w:r>
+        <w:t xml:space="preserve">WVS: Have we created safe ways for voice and disagreement?</w:t>
+      </w:r>
+    </w:p>
+    <w:bookmarkEnd w:id="32"/>
+    <w:bookmarkEnd w:id="33"/>
+    <w:bookmarkStart w:id="34" w:name="references"/>
     <w:p>
       <w:pPr>
         <w:pStyle w:val="Heading1"/>
       </w:pPr>
-      <w:r>
-        <w:rPr>
-          <w:rStyle w:val="SectionNumber"/>
-        </w:rPr>
-        <w:t xml:space="preserve">10</w:t>
-      </w:r>
-      <w:r>
-        <w:tab/>
-      </w:r>
       <w:r>
         <w:t xml:space="preserve">References</w:t>
       </w:r>
@@ -1342,69 +829,6 @@
         <w:pStyle w:val="BodyText"/>
       </w:pPr>
       <w:r>
-        <w:t xml:space="preserve">Dyer, J. H., &amp; Chu, W. (1998). Determinants of trust in supplier relations: Evidence from the automotive industry in Japan and the United States.</w:t>
-      </w:r>
-      <w:r>
-        <w:t xml:space="preserve"> </w:t>
-      </w:r>
-      <w:r>
-        <w:rPr>
-          <w:i/>
-          <w:iCs/>
-        </w:rPr>
-        <w:t xml:space="preserve">Journal of Economic Behavior &amp; Organization, 34</w:t>
-      </w:r>
-      <w:r>
-        <w:t xml:space="preserve">(3), 387–417. https://doi.org/10.1016/S0167-2681(97)00082-6</w:t>
-      </w:r>
-    </w:p>
-    <w:p>
-      <w:pPr>
-        <w:pStyle w:val="BodyText"/>
-      </w:pPr>
-      <w:r>
-        <w:t xml:space="preserve">Google Partner Marketing Hub. (n.d.).</w:t>
-      </w:r>
-      <w:r>
-        <w:t xml:space="preserve"> </w:t>
-      </w:r>
-      <w:r>
-        <w:rPr>
-          <w:i/>
-          <w:iCs/>
-        </w:rPr>
-        <w:t xml:space="preserve">How to show Google’s brand</w:t>
-      </w:r>
-      <w:r>
-        <w:t xml:space="preserve">. Retrieved June 12, 2026, from https://partnermarketinghub.withgoogle.com/brands/google/branding-guidelines/how-to-show-googles-brand/</w:t>
-      </w:r>
-    </w:p>
-    <w:p>
-      <w:pPr>
-        <w:pStyle w:val="BodyText"/>
-      </w:pPr>
-      <w:r>
-        <w:t xml:space="preserve">Graham, J. L., &amp; Sano, Y. (1989). Beware of Japanese negotiation style: How to negotiate with Japanese companies.</w:t>
-      </w:r>
-      <w:r>
-        <w:t xml:space="preserve"> </w:t>
-      </w:r>
-      <w:r>
-        <w:rPr>
-          <w:i/>
-          <w:iCs/>
-        </w:rPr>
-        <w:t xml:space="preserve">Northwestern Journal of International Law &amp; Business, 10</w:t>
-      </w:r>
-      <w:r>
-        <w:t xml:space="preserve">(2), Article 23. https://scholarlycommons.law.northwestern.edu/njilb/vol10/iss2/23</w:t>
-      </w:r>
-    </w:p>
-    <w:p>
-      <w:pPr>
-        <w:pStyle w:val="BodyText"/>
-      </w:pPr>
-      <w:r>
         <w:t xml:space="preserve">Hall, E. T. (1976).</w:t>
       </w:r>
       <w:r>
@@ -1468,48 +892,6 @@
         <w:pStyle w:val="BodyText"/>
       </w:pPr>
       <w:r>
-        <w:t xml:space="preserve">Inglehart, R., &amp; Welzel, C. (2005).</w:t>
-      </w:r>
-      <w:r>
-        <w:t xml:space="preserve"> </w:t>
-      </w:r>
-      <w:r>
-        <w:rPr>
-          <w:i/>
-          <w:iCs/>
-        </w:rPr>
-        <w:t xml:space="preserve">Modernization, cultural change, and democracy: The human development sequence</w:t>
-      </w:r>
-      <w:r>
-        <w:t xml:space="preserve">. Cambridge University Press.</w:t>
-      </w:r>
-    </w:p>
-    <w:p>
-      <w:pPr>
-        <w:pStyle w:val="BodyText"/>
-      </w:pPr>
-      <w:r>
-        <w:t xml:space="preserve">Kirkman, B. L., Lowe, K. B., &amp; Gibson, C. B. (2017). A retrospective on Culture’s Consequences: The 35-year journey.</w:t>
-      </w:r>
-      <w:r>
-        <w:t xml:space="preserve"> </w:t>
-      </w:r>
-      <w:r>
-        <w:rPr>
-          <w:i/>
-          <w:iCs/>
-        </w:rPr>
-        <w:t xml:space="preserve">Journal of International Business Studies, 48</w:t>
-      </w:r>
-      <w:r>
-        <w:t xml:space="preserve">, 12–29. https://doi.org/10.1057/s41267-016-0037-9</w:t>
-      </w:r>
-    </w:p>
-    <w:p>
-      <w:pPr>
-        <w:pStyle w:val="BodyText"/>
-      </w:pPr>
-      <w:r>
         <w:t xml:space="preserve">Nishimura, S., Nevgi, A., &amp; Tella, S. (2008). Communication style and cultural features in high/low context communication cultures: A case study of Finland, Japan and India. University of Helsinki.</w:t>
       </w:r>
     </w:p>
@@ -1539,27 +921,6 @@
         <w:pStyle w:val="BodyText"/>
       </w:pPr>
       <w:r>
-        <w:t xml:space="preserve">Smith, P. B., Trompenaars, F., &amp; Dugan, S. (1995). The Rotter locus of control scale in 43 countries: A test of cultural relativity.</w:t>
-      </w:r>
-      <w:r>
-        <w:t xml:space="preserve"> </w:t>
-      </w:r>
-      <w:r>
-        <w:rPr>
-          <w:i/>
-          <w:iCs/>
-        </w:rPr>
-        <w:t xml:space="preserve">International Journal of Psychology, 30</w:t>
-      </w:r>
-      <w:r>
-        <w:t xml:space="preserve">(3), 377–400. https://doi.org/10.1080/00207599508246576</w:t>
-      </w:r>
-    </w:p>
-    <w:p>
-      <w:pPr>
-        <w:pStyle w:val="BodyText"/>
-      </w:pPr>
-      <w:r>
         <w:t xml:space="preserve">Taras, V., Kirkman, B. L., &amp; Steel, P. (2010). Examining the impact of Culture’s Consequences: A three-decade, multilevel, meta-analytic review of Hofstede’s cultural value dimensions.</w:t>
       </w:r>
       <w:r>
@@ -1602,6 +963,30 @@
         <w:pStyle w:val="BodyText"/>
       </w:pPr>
       <w:r>
+        <w:t xml:space="preserve">Trompenaars, F., &amp; Hampden-Turner, C. (1997).</w:t>
+      </w:r>
+      <w:r>
+        <w:t xml:space="preserve"> </w:t>
+      </w:r>
+      <w:r>
+        <w:rPr>
+          <w:i/>
+          <w:iCs/>
+        </w:rPr>
+        <w:t xml:space="preserve">Riding the waves of culture: Understanding cultural diversity in business</w:t>
+      </w:r>
+      <w:r>
+        <w:t xml:space="preserve"> </w:t>
+      </w:r>
+      <w:r>
+        <w:t xml:space="preserve">(2nd ed.). Nicholas Brealey.</w:t>
+      </w:r>
+    </w:p>
+    <w:p>
+      <w:pPr>
+        <w:pStyle w:val="BodyText"/>
+      </w:pPr>
+      <w:r>
         <w:t xml:space="preserve">World Values Survey Association. (n.d.).</w:t>
       </w:r>
       <w:r>
@@ -1618,7 +1003,7 @@
         <w:t xml:space="preserve">. Retrieved June 12, 2026, from https://www.worldvaluessurvey.org/WVSDocumentationWV7.jsp</w:t>
       </w:r>
     </w:p>
-    <w:bookmarkEnd w:id="41"/>
+    <w:bookmarkEnd w:id="34"/>
     <w:sectPr>
       <w:footnotePr>
         <w:numRestart w:val="eachSect"/>
@@ -1814,10 +1199,152 @@
       </w:pPr>
     </w:lvl>
   </w:abstractNum>
+  <w:abstractNum w:abstractNumId="991">
+    <w:nsid w:val="0000A991"/>
+    <w:multiLevelType w:val="multilevel"/>
+    <w:lvl w:ilvl="0">
+      <w:numFmt w:val="bullet"/>
+      <w:lvlText w:val=""/>
+      <w:lvlJc w:val="left"/>
+      <w:pPr>
+        <w:ind w:left="720" w:hanging="360"/>
+      </w:pPr>
+      <w:rPr>
+        <w:rFonts w:ascii="Symbol" w:hAnsi="Symbol" w:cs="Symbol" w:hint="default"/>
+      </w:rPr>
+    </w:lvl>
+    <w:lvl w:ilvl="1">
+      <w:numFmt w:val="bullet"/>
+      <w:lvlText w:val="o"/>
+      <w:lvlJc w:val="left"/>
+      <w:pPr>
+        <w:ind w:left="1440" w:hanging="360"/>
+      </w:pPr>
+      <w:rPr>
+        <w:rFonts w:ascii="Courier New" w:hAnsi="Courier New" w:cs="Courier New" w:hint="default"/>
+      </w:rPr>
+    </w:lvl>
+    <w:lvl w:ilvl="2">
+      <w:numFmt w:val="bullet"/>
+      <w:lvlText w:val=""/>
+      <w:lvlJc w:val="left"/>
+      <w:pPr>
+        <w:ind w:left="2160" w:hanging="360"/>
+      </w:pPr>
+      <w:rPr>
+        <w:rFonts w:ascii="Wingdings" w:hAnsi="Wingdings" w:cs="Wingdings" w:hint="default"/>
+      </w:rPr>
+    </w:lvl>
+    <w:lvl w:ilvl="3">
+      <w:numFmt w:val="bullet"/>
+      <w:lvlText w:val=""/>
+      <w:lvlJc w:val="left"/>
+      <w:pPr>
+        <w:ind w:left="2880" w:hanging="360"/>
+      </w:pPr>
+      <w:rPr>
+        <w:rFonts w:ascii="Symbol" w:hAnsi="Symbol" w:cs="Symbol" w:hint="default"/>
+      </w:rPr>
+    </w:lvl>
+    <w:lvl w:ilvl="4">
+      <w:numFmt w:val="bullet"/>
+      <w:lvlText w:val="o"/>
+      <w:lvlJc w:val="left"/>
+      <w:pPr>
+        <w:ind w:left="3600" w:hanging="360"/>
+      </w:pPr>
+      <w:rPr>
+        <w:rFonts w:ascii="Courier New" w:hAnsi="Courier New" w:cs="Courier New" w:hint="default"/>
+      </w:rPr>
+    </w:lvl>
+    <w:lvl w:ilvl="5">
+      <w:numFmt w:val="bullet"/>
+      <w:lvlText w:val=""/>
+      <w:lvlJc w:val="left"/>
+      <w:pPr>
+        <w:ind w:left="4320" w:hanging="360"/>
+      </w:pPr>
+      <w:rPr>
+        <w:rFonts w:ascii="Wingdings" w:hAnsi="Wingdings" w:cs="Wingdings" w:hint="default"/>
+      </w:rPr>
+    </w:lvl>
+    <w:lvl w:ilvl="6">
+      <w:numFmt w:val="bullet"/>
+      <w:lvlText w:val=""/>
+      <w:lvlJc w:val="left"/>
+      <w:pPr>
+        <w:ind w:left="5040" w:hanging="360"/>
+      </w:pPr>
+      <w:rPr>
+        <w:rFonts w:ascii="Symbol" w:hAnsi="Symbol" w:cs="Symbol" w:hint="default"/>
+      </w:rPr>
+    </w:lvl>
+    <w:lvl w:ilvl="7">
+      <w:numFmt w:val="bullet"/>
+      <w:lvlText w:val="o"/>
+      <w:lvlJc w:val="left"/>
+      <w:pPr>
+        <w:ind w:left="5760" w:hanging="360"/>
+      </w:pPr>
+      <w:rPr>
+        <w:rFonts w:ascii="Courier New" w:hAnsi="Courier New" w:cs="Courier New" w:hint="default"/>
+      </w:rPr>
+    </w:lvl>
+    <w:lvl w:ilvl="8">
+      <w:numFmt w:val="bullet"/>
+      <w:lvlText w:val=""/>
+      <w:lvlJc w:val="left"/>
+      <w:pPr>
+        <w:ind w:left="6480" w:hanging="360"/>
+      </w:pPr>
+      <w:rPr>
+        <w:rFonts w:ascii="Wingdings" w:hAnsi="Wingdings" w:cs="Wingdings" w:hint="default"/>
+      </w:rPr>
+    </w:lvl>
+  </w:abstractNum>
   <w:num w:numId="1000">
     <w:abstractNumId w:val="990"/>
   </w:num>
   <w:num w:numId="1001">
+    <w:abstractNumId w:val="99411"/>
+    <w:lvlOverride w:ilvl="0">
+      <w:startOverride w:val="1"/>
+    </w:lvlOverride>
+    <w:lvlOverride w:ilvl="1">
+      <w:startOverride w:val="1"/>
+    </w:lvlOverride>
+    <w:lvlOverride w:ilvl="2">
+      <w:startOverride w:val="1"/>
+    </w:lvlOverride>
+    <w:lvlOverride w:ilvl="3">
+      <w:startOverride w:val="1"/>
+    </w:lvlOverride>
+    <w:lvlOverride w:ilvl="4">
+      <w:startOverride w:val="1"/>
+    </w:lvlOverride>
+    <w:lvlOverride w:ilvl="5">
+      <w:startOverride w:val="1"/>
+    </w:lvlOverride>
+    <w:lvlOverride w:ilvl="6">
+      <w:startOverride w:val="1"/>
+    </w:lvlOverride>
+    <w:lvlOverride w:ilvl="7">
+      <w:startOverride w:val="1"/>
+    </w:lvlOverride>
+    <w:lvlOverride w:ilvl="8">
+      <w:startOverride w:val="1"/>
+    </w:lvlOverride>
+  </w:num>
+  <w:num w:numId="1002">
+    <w:abstractNumId w:val="991"/>
+  </w:num>
+  <w:num w:numId="1003">
+    <w:abstractNumId w:val="991"/>
+  </w:num>
+  <w:num w:numId="1004">
+    <w:abstractNumId w:val="991"/>
+  </w:num>
+  <w:num w:numId="1005">
     <w:abstractNumId w:val="99411"/>
     <w:lvlOverride w:ilvl="0">
       <w:startOverride w:val="1"/>

</xml_diff>

<commit_message>
Refresh downloadable report artifacts
</commit_message>
<xml_diff>
--- a/report.docx
+++ b/report.docx
@@ -7,7 +7,7 @@
         <w:pStyle w:val="Title"/>
       </w:pPr>
       <w:r>
-        <w:t xml:space="preserve">US Google Advertising Managers to Japan — Model-Grounded Training Report</w:t>
+        <w:t xml:space="preserve">US Google Advertising Managers to Japan — Manager Field Guide Source Report</w:t>
       </w:r>
     </w:p>
     <w:p>
@@ -15,7 +15,7 @@
         <w:pStyle w:val="Subtitle"/>
       </w:pPr>
       <w:r>
-        <w:t xml:space="preserve">Hofstede, Hall, Trompenaars, and World Values Survey / Inglehart-Welzel</w:t>
+        <w:t xml:space="preserve">Behavioral recommendations with cultural-model rationale</w:t>
       </w:r>
     </w:p>
     <w:p>
@@ -85,7 +85,7 @@
         <w:pStyle w:val="BodyText"/>
       </w:pPr>
       <w:r>
-        <w:t xml:space="preserve">The analysis is deliberately grounded in the four required cultural models only: Hofstede, Hall, Trompenaars, and the World Values Survey / Inglehart-Welzel cultural map. The models do not define individuals. They provide structured hypotheses for preparation, comparison, risk identification, and guideline development.</w:t>
+        <w:t xml:space="preserve">The analysis uses Hofstede, Hall, Trompenaars, and the World Values Survey / Inglehart-Welzel cultural map as supporting rationale. The visible training should not revolve around model names. The models do not define individuals; they explain why the recommended manager behaviors are likely to work.</w:t>
       </w:r>
     </w:p>
     <w:p>
@@ -153,7 +153,7 @@
         <w:t xml:space="preserve"> </w:t>
       </w:r>
       <w:r>
-        <w:t xml:space="preserve">inside Google Advertising. The relevant management task is not campaign development for advertisers but the sale and support of platform advertising solutions.</w:t>
+        <w:t xml:space="preserve">inside Google Advertising. The relevant management task is the sale and support of platform advertising solutions while advertisers remain responsible for their own creative and media execution.</w:t>
       </w:r>
     </w:p>
     <w:p>

</xml_diff>